<commit_message>
CAMBIOS PARA GUARDAR DEFECTOS CRITICOS Y TRADUCCION A INGLES ASI COMO CAMBIOS EN EL CREPORTE DE CERTIFICACION
</commit_message>
<xml_diff>
--- a/60_PPM'S_CERTIFICACION/Docs/mejoras en el sistema de calidad.docx
+++ b/60_PPM'S_CERTIFICACION/Docs/mejoras en el sistema de calidad.docx
@@ -352,7 +352,7 @@
       </w:pPr>
       <w:r>
         <w:rPr>
-          <w:highlight w:val="yellow"/>
+          <w:highlight w:val="darkGreen"/>
           <w:lang w:val="es-MX"/>
         </w:rPr>
         <w:t xml:space="preserve">4 separar en el Sistema los </w:t>
@@ -360,7 +360,7 @@
       <w:proofErr w:type="gramStart"/>
       <w:r>
         <w:rPr>
-          <w:highlight w:val="yellow"/>
+          <w:highlight w:val="darkGreen"/>
           <w:lang w:val="es-MX"/>
         </w:rPr>
         <w:t>turnos  3</w:t>
@@ -368,7 +368,7 @@
       <w:proofErr w:type="gramEnd"/>
       <w:r>
         <w:rPr>
-          <w:highlight w:val="yellow"/>
+          <w:highlight w:val="darkGreen"/>
           <w:lang w:val="es-MX"/>
         </w:rPr>
         <w:t>ro y 2do.</w:t>
@@ -432,6 +432,7 @@
     <w:p>
       <w:pPr>
         <w:rPr>
+          <w:highlight w:val="red"/>
           <w:lang w:val="es-MX"/>
         </w:rPr>
       </w:pPr>
@@ -483,7 +484,7 @@
       </w:pPr>
       <w:r>
         <w:rPr>
-          <w:highlight w:val="yellow"/>
+          <w:highlight w:val="red"/>
           <w:lang w:val="es-MX"/>
         </w:rPr>
         <w:t xml:space="preserve">8 Que el Sistema de perforadora no permita </w:t>
@@ -491,7 +492,7 @@
       <w:proofErr w:type="spellStart"/>
       <w:r>
         <w:rPr>
-          <w:highlight w:val="yellow"/>
+          <w:highlight w:val="red"/>
           <w:lang w:val="es-MX"/>
         </w:rPr>
         <w:t>scanear</w:t>
@@ -499,7 +500,7 @@
       <w:proofErr w:type="spellEnd"/>
       <w:r>
         <w:rPr>
-          <w:highlight w:val="yellow"/>
+          <w:highlight w:val="red"/>
           <w:lang w:val="es-MX"/>
         </w:rPr>
         <w:t xml:space="preserve"> otra caja al inspector hasta que libere la </w:t>
@@ -507,7 +508,7 @@
       <w:proofErr w:type="gramStart"/>
       <w:r>
         <w:rPr>
-          <w:highlight w:val="yellow"/>
+          <w:highlight w:val="red"/>
           <w:lang w:val="es-MX"/>
         </w:rPr>
         <w:t>orden ,en</w:t>
@@ -515,7 +516,7 @@
       <w:proofErr w:type="gramEnd"/>
       <w:r>
         <w:rPr>
-          <w:highlight w:val="yellow"/>
+          <w:highlight w:val="red"/>
           <w:lang w:val="es-MX"/>
         </w:rPr>
         <w:t xml:space="preserve"> caso de ser la </w:t>
@@ -523,7 +524,7 @@
       <w:proofErr w:type="spellStart"/>
       <w:r>
         <w:rPr>
-          <w:highlight w:val="yellow"/>
+          <w:highlight w:val="red"/>
           <w:lang w:val="es-MX"/>
         </w:rPr>
         <w:t>ultima</w:t>
@@ -531,7 +532,7 @@
       <w:proofErr w:type="spellEnd"/>
       <w:r>
         <w:rPr>
-          <w:highlight w:val="yellow"/>
+          <w:highlight w:val="red"/>
           <w:lang w:val="es-MX"/>
         </w:rPr>
         <w:t xml:space="preserve"> caja. (ya que no se </w:t>
@@ -539,7 +540,7 @@
       <w:proofErr w:type="spellStart"/>
       <w:r>
         <w:rPr>
-          <w:highlight w:val="yellow"/>
+          <w:highlight w:val="red"/>
           <w:lang w:val="es-MX"/>
         </w:rPr>
         <w:t>estan</w:t>
@@ -547,7 +548,7 @@
       <w:proofErr w:type="spellEnd"/>
       <w:r>
         <w:rPr>
-          <w:highlight w:val="yellow"/>
+          <w:highlight w:val="red"/>
           <w:lang w:val="es-MX"/>
         </w:rPr>
         <w:t xml:space="preserve"> liberando las ordenes de la perforadora y se acumulan)</w:t>
@@ -660,7 +661,7 @@
       </w:pPr>
       <w:r>
         <w:rPr>
-          <w:highlight w:val="yellow"/>
+          <w:highlight w:val="red"/>
           <w:lang w:val="es-MX"/>
         </w:rPr>
         <w:t xml:space="preserve">10 </w:t>
@@ -668,7 +669,7 @@
       <w:proofErr w:type="gramStart"/>
       <w:r>
         <w:rPr>
-          <w:highlight w:val="yellow"/>
+          <w:highlight w:val="red"/>
           <w:lang w:val="es-MX"/>
         </w:rPr>
         <w:t>Que</w:t>
@@ -676,7 +677,7 @@
       <w:proofErr w:type="gramEnd"/>
       <w:r>
         <w:rPr>
-          <w:highlight w:val="yellow"/>
+          <w:highlight w:val="red"/>
           <w:lang w:val="es-MX"/>
         </w:rPr>
         <w:t xml:space="preserve"> los </w:t>
@@ -684,7 +685,7 @@
       <w:proofErr w:type="spellStart"/>
       <w:r>
         <w:rPr>
-          <w:highlight w:val="yellow"/>
+          <w:highlight w:val="red"/>
           <w:lang w:val="es-MX"/>
         </w:rPr>
         <w:t>numeros</w:t>
@@ -692,7 +693,7 @@
       <w:proofErr w:type="spellEnd"/>
       <w:r>
         <w:rPr>
-          <w:highlight w:val="yellow"/>
+          <w:highlight w:val="red"/>
           <w:lang w:val="es-MX"/>
         </w:rPr>
         <w:t xml:space="preserve"> de parte de ordenes nuevas o cambios de </w:t>
@@ -700,7 +701,7 @@
       <w:proofErr w:type="spellStart"/>
       <w:r>
         <w:rPr>
-          <w:highlight w:val="yellow"/>
+          <w:highlight w:val="red"/>
           <w:lang w:val="es-MX"/>
         </w:rPr>
         <w:t>ingenieria</w:t>
@@ -708,7 +709,7 @@
       <w:proofErr w:type="spellEnd"/>
       <w:r>
         <w:rPr>
-          <w:highlight w:val="yellow"/>
+          <w:highlight w:val="red"/>
           <w:lang w:val="es-MX"/>
         </w:rPr>
         <w:t xml:space="preserve"> se den de alta en </w:t>
@@ -716,7 +717,7 @@
       <w:proofErr w:type="spellStart"/>
       <w:r>
         <w:rPr>
-          <w:highlight w:val="yellow"/>
+          <w:highlight w:val="red"/>
           <w:lang w:val="es-MX"/>
         </w:rPr>
         <w:t>automatico</w:t>
@@ -724,7 +725,7 @@
       <w:proofErr w:type="spellEnd"/>
       <w:r>
         <w:rPr>
-          <w:highlight w:val="yellow"/>
+          <w:highlight w:val="red"/>
           <w:lang w:val="es-MX"/>
         </w:rPr>
         <w:t>.</w:t>
@@ -765,12 +766,25 @@
           <w:highlight w:val="yellow"/>
           <w:lang w:val="es-MX"/>
         </w:rPr>
-        <w:t>programa ,si</w:t>
+        <w:t>programa</w:t>
+      </w:r>
+      <w:r>
+        <w:rPr>
+          <w:lang w:val="es-MX"/>
+        </w:rPr>
+        <w:t xml:space="preserve"> </w:t>
+      </w:r>
+      <w:r>
+        <w:rPr>
+          <w:highlight w:val="red"/>
+          <w:lang w:val="es-MX"/>
+        </w:rPr>
+        <w:t>,si</w:t>
       </w:r>
       <w:proofErr w:type="gramEnd"/>
       <w:r>
         <w:rPr>
-          <w:highlight w:val="yellow"/>
+          <w:highlight w:val="red"/>
           <w:lang w:val="es-MX"/>
         </w:rPr>
         <w:t xml:space="preserve"> es perforado , </w:t>
@@ -778,7 +792,7 @@
       <w:proofErr w:type="spellStart"/>
       <w:r>
         <w:rPr>
-          <w:highlight w:val="yellow"/>
+          <w:highlight w:val="red"/>
           <w:lang w:val="es-MX"/>
         </w:rPr>
         <w:t>quilting</w:t>
@@ -786,7 +800,7 @@
       <w:proofErr w:type="spellEnd"/>
       <w:r>
         <w:rPr>
-          <w:highlight w:val="yellow"/>
+          <w:highlight w:val="red"/>
           <w:lang w:val="es-MX"/>
         </w:rPr>
         <w:t xml:space="preserve"> y tipo de piel.</w:t>
@@ -800,7 +814,7 @@
       </w:pPr>
       <w:r>
         <w:rPr>
-          <w:highlight w:val="darkGreen"/>
+          <w:highlight w:val="yellow"/>
           <w:lang w:val="es-MX"/>
         </w:rPr>
         <w:t xml:space="preserve">12 Generar los reportes de </w:t>
@@ -808,7 +822,7 @@
       <w:proofErr w:type="spellStart"/>
       <w:r>
         <w:rPr>
-          <w:highlight w:val="darkGreen"/>
+          <w:highlight w:val="yellow"/>
           <w:lang w:val="es-MX"/>
         </w:rPr>
         <w:t>ppms</w:t>
@@ -816,7 +830,7 @@
       <w:proofErr w:type="spellEnd"/>
       <w:r>
         <w:rPr>
-          <w:highlight w:val="darkGreen"/>
+          <w:highlight w:val="yellow"/>
           <w:lang w:val="es-MX"/>
         </w:rPr>
         <w:t xml:space="preserve"> en </w:t>
@@ -824,7 +838,7 @@
       <w:proofErr w:type="spellStart"/>
       <w:r>
         <w:rPr>
-          <w:highlight w:val="darkGreen"/>
+          <w:highlight w:val="yellow"/>
           <w:lang w:val="es-MX"/>
         </w:rPr>
         <w:t>automatico</w:t>
@@ -832,7 +846,7 @@
       <w:proofErr w:type="spellEnd"/>
       <w:r>
         <w:rPr>
-          <w:highlight w:val="darkGreen"/>
+          <w:highlight w:val="yellow"/>
           <w:lang w:val="es-MX"/>
         </w:rPr>
         <w:t xml:space="preserve"> sin darle </w:t>
@@ -840,7 +854,7 @@
       <w:proofErr w:type="gramStart"/>
       <w:r>
         <w:rPr>
-          <w:highlight w:val="darkGreen"/>
+          <w:highlight w:val="yellow"/>
           <w:lang w:val="es-MX"/>
         </w:rPr>
         <w:t>formato ,subrayar</w:t>
@@ -848,7 +862,7 @@
       <w:proofErr w:type="gramEnd"/>
       <w:r>
         <w:rPr>
-          <w:highlight w:val="darkGreen"/>
+          <w:highlight w:val="yellow"/>
           <w:lang w:val="es-MX"/>
         </w:rPr>
         <w:t xml:space="preserve"> defectos criticos.</w:t>
@@ -862,7 +876,7 @@
       </w:pPr>
       <w:r>
         <w:rPr>
-          <w:highlight w:val="darkGreen"/>
+          <w:highlight w:val="yellow"/>
           <w:lang w:val="es-MX"/>
         </w:rPr>
         <w:t xml:space="preserve">13 Que se puedan eliminar en el Sistema las cajas que pasan por la </w:t>
@@ -870,7 +884,7 @@
       <w:proofErr w:type="gramStart"/>
       <w:r>
         <w:rPr>
-          <w:highlight w:val="darkGreen"/>
+          <w:highlight w:val="yellow"/>
           <w:lang w:val="es-MX"/>
         </w:rPr>
         <w:t>perforadora ,ya</w:t>
@@ -878,7 +892,7 @@
       <w:proofErr w:type="gramEnd"/>
       <w:r>
         <w:rPr>
-          <w:highlight w:val="darkGreen"/>
+          <w:highlight w:val="yellow"/>
           <w:lang w:val="es-MX"/>
         </w:rPr>
         <w:t xml:space="preserve"> que en </w:t>
@@ -886,14 +900,14 @@
       <w:proofErr w:type="spellStart"/>
       <w:r>
         <w:rPr>
-          <w:highlight w:val="darkGreen"/>
+          <w:highlight w:val="yellow"/>
           <w:lang w:val="es-MX"/>
         </w:rPr>
         <w:t>ocacion</w:t>
       </w:r>
       <w:r>
         <w:rPr>
-          <w:highlight w:val="darkGreen"/>
+          <w:highlight w:val="yellow"/>
           <w:lang w:val="es-MX"/>
         </w:rPr>
         <w:t>es</w:t>
@@ -901,21 +915,21 @@
       <w:proofErr w:type="spellEnd"/>
       <w:r>
         <w:rPr>
-          <w:highlight w:val="darkGreen"/>
+          <w:highlight w:val="yellow"/>
           <w:lang w:val="es-MX"/>
         </w:rPr>
         <w:t xml:space="preserve"> </w:t>
       </w:r>
       <w:r>
         <w:rPr>
-          <w:highlight w:val="darkGreen"/>
+          <w:highlight w:val="yellow"/>
           <w:lang w:val="es-MX"/>
         </w:rPr>
         <w:t xml:space="preserve"> la pantalla se apaga o se reinicia y no pue</w:t>
       </w:r>
       <w:r>
         <w:rPr>
-          <w:highlight w:val="darkGreen"/>
+          <w:highlight w:val="yellow"/>
           <w:lang w:val="es-MX"/>
         </w:rPr>
         <w:t>den volver a escanearla y seguir con el proceso.</w:t>
@@ -997,7 +1011,7 @@
         <v:path o:extrusionok="f" gradientshapeok="t" o:connecttype="rect"/>
         <o:lock v:ext="edit" aspectratio="t"/>
       </v:shapetype>
-      <v:shape id="_x0000_i1047" type="#_x0000_t75" style="width:11.5pt;height:11.5pt" o:bullet="t">
+      <v:shape id="_x0000_i1056" type="#_x0000_t75" style="width:11.5pt;height:11.5pt" o:bullet="t">
         <v:imagedata r:id="rId1" o:title="msoF268"/>
       </v:shape>
     </w:pict>
@@ -1310,6 +1324,7 @@
     <w:lsdException w:name="HTML Sample" w:semiHidden="1" w:unhideWhenUsed="1"/>
     <w:lsdException w:name="HTML Typewriter" w:semiHidden="1" w:unhideWhenUsed="1"/>
     <w:lsdException w:name="HTML Variable" w:semiHidden="1" w:unhideWhenUsed="1"/>
+    <w:lsdException w:name="Normal Table" w:semiHidden="1" w:unhideWhenUsed="1"/>
     <w:lsdException w:name="annotation subject" w:semiHidden="1" w:unhideWhenUsed="1"/>
     <w:lsdException w:name="No List" w:semiHidden="1" w:unhideWhenUsed="1"/>
     <w:lsdException w:name="Outline List 1" w:semiHidden="1" w:unhideWhenUsed="1"/>
@@ -1352,8 +1367,11 @@
     <w:lsdException w:name="Table Contemporary" w:semiHidden="1" w:unhideWhenUsed="1"/>
     <w:lsdException w:name="Table Elegant" w:semiHidden="1" w:unhideWhenUsed="1"/>
     <w:lsdException w:name="Table Professional" w:semiHidden="1" w:unhideWhenUsed="1"/>
+    <w:lsdException w:name="Table Subtle 1" w:semiHidden="1" w:unhideWhenUsed="1"/>
     <w:lsdException w:name="Table Subtle 2" w:semiHidden="1" w:unhideWhenUsed="1"/>
     <w:lsdException w:name="Table Web 1" w:semiHidden="1" w:unhideWhenUsed="1"/>
+    <w:lsdException w:name="Table Web 2" w:semiHidden="1" w:unhideWhenUsed="1"/>
+    <w:lsdException w:name="Table Web 3" w:semiHidden="1" w:unhideWhenUsed="1"/>
     <w:lsdException w:name="Balloon Text" w:semiHidden="1" w:unhideWhenUsed="1"/>
     <w:lsdException w:name="Table Grid" w:uiPriority="39"/>
     <w:lsdException w:name="Table Theme" w:semiHidden="1" w:unhideWhenUsed="1"/>

</xml_diff>